<commit_message>
Ubah template word final & responsif untuk mobile
</commit_message>
<xml_diff>
--- a/backend/templates/ba-drop-template.docx
+++ b/backend/templates/ba-drop-template.docx
@@ -2,19 +2,6 @@
 <file path=word/document.xml><?xml version="1.0" encoding="utf-8"?>
 <w:document xmlns:wpc="http://schemas.microsoft.com/office/word/2010/wordprocessingCanvas" xmlns:cx="http://schemas.microsoft.com/office/drawing/2014/chartex" xmlns:cx1="http://schemas.microsoft.com/office/drawing/2015/9/8/chartex" xmlns:cx2="http://schemas.microsoft.com/office/drawing/2015/10/21/chartex" xmlns:cx3="http://schemas.microsoft.com/office/drawing/2016/5/9/chartex" xmlns:cx4="http://schemas.microsoft.com/office/drawing/2016/5/10/chartex" xmlns:cx5="http://schemas.microsoft.com/office/drawing/2016/5/11/chartex" xmlns:cx6="http://schemas.microsoft.com/office/drawing/2016/5/12/chartex" xmlns:cx7="http://schemas.microsoft.com/office/drawing/2016/5/13/chartex" xmlns:cx8="http://schemas.microsoft.com/office/drawing/2016/5/14/chartex" xmlns:mc="http://schemas.openxmlformats.org/markup-compatibility/2006" xmlns:aink="http://schemas.microsoft.com/office/drawing/2016/ink" xmlns:am3d="http://schemas.microsoft.com/office/drawing/2017/model3d" xmlns:o="urn:schemas-microsoft-com:office:office" xmlns:oel="http://schemas.microsoft.com/office/2019/extlst" xmlns:r="http://schemas.openxmlformats.org/officeDocument/2006/relationships" xmlns:m="http://schemas.openxmlformats.org/officeDocument/2006/math" xmlns:v="urn:schemas-microsoft-com:vml" xmlns:wp14="http://schemas.microsoft.com/office/word/2010/wordprocessingDrawing" xmlns:wp="http://schemas.openxmlformats.org/drawingml/2006/wordprocessingDrawing" xmlns:w10="urn:schemas-microsoft-com:office:word" xmlns:w="http://schemas.openxmlformats.org/wordprocessingml/2006/main" xmlns:w14="http://schemas.microsoft.com/office/word/2010/wordml" xmlns:w15="http://schemas.microsoft.com/office/word/2012/wordml" xmlns:w16cex="http://schemas.microsoft.com/office/word/2018/wordml/cex" xmlns:w16cid="http://schemas.microsoft.com/office/word/2016/wordml/cid" xmlns:w16="http://schemas.microsoft.com/office/word/2018/wordml" xmlns:w16du="http://schemas.microsoft.com/office/word/2023/wordml/word16du" xmlns:w16sdtdh="http://schemas.microsoft.com/office/word/2020/wordml/sdtdatahash" xmlns:w16sdtfl="http://schemas.microsoft.com/office/word/2024/wordml/sdtformatlock" xmlns:w16se="http://schemas.microsoft.com/office/word/2015/wordml/symex" xmlns:wpg="http://schemas.microsoft.com/office/word/2010/wordprocessingGroup" xmlns:wpi="http://schemas.microsoft.com/office/word/2010/wordprocessingInk" xmlns:wne="http://schemas.microsoft.com/office/word/2006/wordml" xmlns:wps="http://schemas.microsoft.com/office/word/2010/wordprocessingShape" mc:Ignorable="w14 w15 w16se w16cid w16 w16cex w16sdtdh w16sdtfl w16du wp14">
   <w:body>
-    <w:p>
-      <w:pPr>
-        <w:pBdr>
-          <w:bottom w:val="single" w:sz="10" w:space="5" w:color="000000"/>
-        </w:pBdr>
-        <w:spacing w:before="60" w:after="160"/>
-        <w:jc w:val="center"/>
-        <w:rPr>
-          <w:b/>
-          <w:sz w:val="28"/>
-        </w:rPr>
-      </w:pPr>
-    </w:p>
     <w:p>
       <w:pPr>
         <w:pBdr>
@@ -923,10 +910,637 @@
         <w:t xml:space="preserve"> LOP tersebut tidak dapat dilanjutkan pekerjaannya berdasarkan kendala keterangan di atas.</w:t>
       </w:r>
     </w:p>
+    <w:p>
+      <w:r>
+        <w:br w:type="page"/>
+      </w:r>
+    </w:p>
+    <w:p>
+      <w:pPr>
+        <w:spacing w:after="520"/>
+        <w:jc w:val="both"/>
+      </w:pPr>
+      <w:r>
+        <w:lastRenderedPageBreak/>
+        <w:t xml:space="preserve">Setelah berkoordinasi dengan Telkomsel dan TIF pada project yang terdapat dalam </w:t>
+      </w:r>
+      <w:r>
+        <w:rPr>
+          <w:b/>
+        </w:rPr>
+        <w:t>{judulProyek}</w:t>
+      </w:r>
+      <w:r>
+        <w:t xml:space="preserve">, untuk </w:t>
+      </w:r>
+      <w:r>
+        <w:rPr>
+          <w:b/>
+        </w:rPr>
+        <w:t>{jumlahLop} LOP</w:t>
+      </w:r>
+      <w:r>
+        <w:t xml:space="preserve"> tersebut tidak dapat dilanjutkan pekerjaannya berdasarkan kendala keterangan di atas. Demikian Berita Acara Drop Pekerjaan ini dibuat sesuai keadaan sebenarnya dan untuk dipergunakan sebagaimana mestinya.</w:t>
+      </w:r>
+    </w:p>
+    <w:p>
+      <w:pPr>
+        <w:spacing w:after="520"/>
+        <w:jc w:val="right"/>
+      </w:pPr>
+      <w:r>
+        <w:t>{tanggalDokumen}</w:t>
+      </w:r>
+    </w:p>
+    <w:tbl>
+      <w:tblPr>
+        <w:tblW w:w="0" w:type="auto"/>
+        <w:jc w:val="center"/>
+        <w:tblLayout w:type="fixed"/>
+        <w:tblLook w:val="04A0" w:firstRow="1" w:lastRow="0" w:firstColumn="1" w:lastColumn="0" w:noHBand="0" w:noVBand="1"/>
+      </w:tblPr>
+      <w:tblGrid>
+        <w:gridCol w:w="5216"/>
+        <w:gridCol w:w="5216"/>
+      </w:tblGrid>
+      <w:tr>
+        <w:trPr>
+          <w:jc w:val="center"/>
+        </w:trPr>
+        <w:tc>
+          <w:tcPr>
+            <w:tcW w:w="5216" w:type="dxa"/>
+            <w:tcBorders>
+              <w:top w:val="nil"/>
+              <w:left w:val="nil"/>
+              <w:bottom w:val="nil"/>
+              <w:right w:val="nil"/>
+            </w:tcBorders>
+            <w:tcMar>
+              <w:top w:w="40" w:type="dxa"/>
+              <w:left w:w="60" w:type="dxa"/>
+              <w:bottom w:w="40" w:type="dxa"/>
+              <w:right w:w="60" w:type="dxa"/>
+            </w:tcMar>
+          </w:tcPr>
+          <w:p>
+            <w:pPr>
+              <w:spacing w:after="0"/>
+              <w:jc w:val="center"/>
+            </w:pPr>
+            <w:r>
+              <w:rPr>
+                <w:b/>
+              </w:rPr>
+              <w:t>PT. TELKOM AKSES</w:t>
+            </w:r>
+            <w:r>
+              <w:rPr>
+                <w:b/>
+              </w:rPr>
+              <w:br/>
+              <w:t>SO PROJECT DEPLOYMENT</w:t>
+            </w:r>
+            <w:r>
+              <w:rPr>
+                <w:b/>
+              </w:rPr>
+              <w:br/>
+              <w:t>AREA JAWA BALI</w:t>
+            </w:r>
+            <w:r>
+              <w:rPr>
+                <w:b/>
+              </w:rPr>
+              <w:br/>
+            </w:r>
+            <w:r>
+              <w:br/>
+            </w:r>
+            <w:r>
+              <w:br/>
+            </w:r>
+            <w:r>
+              <w:br/>
+            </w:r>
+            <w:r>
+              <w:rPr>
+                <w:b/>
+                <w:u w:val="single"/>
+              </w:rPr>
+              <w:t>{signer1Name}</w:t>
+            </w:r>
+            <w:r>
+              <w:rPr>
+                <w:b/>
+                <w:u w:val="single"/>
+              </w:rPr>
+              <w:br/>
+            </w:r>
+            <w:r>
+              <w:rPr>
+                <w:b/>
+              </w:rPr>
+              <w:t>{signer1Nik}</w:t>
+            </w:r>
+          </w:p>
+        </w:tc>
+        <w:tc>
+          <w:tcPr>
+            <w:tcW w:w="5216" w:type="dxa"/>
+            <w:tcBorders>
+              <w:top w:val="nil"/>
+              <w:left w:val="nil"/>
+              <w:bottom w:val="nil"/>
+              <w:right w:val="nil"/>
+            </w:tcBorders>
+            <w:tcMar>
+              <w:top w:w="40" w:type="dxa"/>
+              <w:left w:w="60" w:type="dxa"/>
+              <w:bottom w:w="40" w:type="dxa"/>
+              <w:right w:w="60" w:type="dxa"/>
+            </w:tcMar>
+          </w:tcPr>
+          <w:p>
+            <w:pPr>
+              <w:spacing w:after="0"/>
+              <w:jc w:val="center"/>
+            </w:pPr>
+            <w:r>
+              <w:rPr>
+                <w:b/>
+              </w:rPr>
+              <w:t>PT. TELKOM INFRASTRUKTUR</w:t>
+            </w:r>
+            <w:r>
+              <w:rPr>
+                <w:b/>
+              </w:rPr>
+              <w:br/>
+              <w:t>INDONESIA</w:t>
+            </w:r>
+            <w:r>
+              <w:rPr>
+                <w:b/>
+              </w:rPr>
+              <w:br/>
+              <w:t>OFF 2 OM &amp; PROJECT OUTSIDE PLANT</w:t>
+            </w:r>
+            <w:r>
+              <w:rPr>
+                <w:b/>
+              </w:rPr>
+              <w:br/>
+            </w:r>
+            <w:r>
+              <w:br/>
+            </w:r>
+            <w:r>
+              <w:br/>
+            </w:r>
+            <w:r>
+              <w:br/>
+            </w:r>
+            <w:r>
+              <w:rPr>
+                <w:b/>
+                <w:u w:val="single"/>
+              </w:rPr>
+              <w:t>{signer2Name}</w:t>
+            </w:r>
+            <w:r>
+              <w:rPr>
+                <w:b/>
+                <w:u w:val="single"/>
+              </w:rPr>
+              <w:br/>
+            </w:r>
+            <w:r>
+              <w:rPr>
+                <w:b/>
+              </w:rPr>
+              <w:t>{signer2Nik}</w:t>
+            </w:r>
+          </w:p>
+        </w:tc>
+      </w:tr>
+    </w:tbl>
+    <w:p>
+      <w:pPr>
+        <w:spacing w:before="280" w:after="100"/>
+        <w:jc w:val="center"/>
+      </w:pPr>
+      <w:r>
+        <w:t>Mengetahui dan Menyetujui,</w:t>
+      </w:r>
+    </w:p>
+    <w:tbl>
+      <w:tblPr>
+        <w:tblW w:w="0" w:type="auto"/>
+        <w:jc w:val="center"/>
+        <w:tblLayout w:type="fixed"/>
+        <w:tblLook w:val="04A0" w:firstRow="1" w:lastRow="0" w:firstColumn="1" w:lastColumn="0" w:noHBand="0" w:noVBand="1"/>
+      </w:tblPr>
+      <w:tblGrid>
+        <w:gridCol w:w="3458"/>
+        <w:gridCol w:w="3458"/>
+        <w:gridCol w:w="3458"/>
+      </w:tblGrid>
+      <w:tr>
+        <w:trPr>
+          <w:jc w:val="center"/>
+        </w:trPr>
+        <w:tc>
+          <w:tcPr>
+            <w:tcW w:w="3458" w:type="dxa"/>
+            <w:tcBorders>
+              <w:top w:val="nil"/>
+              <w:left w:val="nil"/>
+              <w:bottom w:val="nil"/>
+              <w:right w:val="nil"/>
+            </w:tcBorders>
+            <w:tcMar>
+              <w:top w:w="40" w:type="dxa"/>
+              <w:left w:w="60" w:type="dxa"/>
+              <w:bottom w:w="40" w:type="dxa"/>
+              <w:right w:w="60" w:type="dxa"/>
+            </w:tcMar>
+          </w:tcPr>
+          <w:p>
+            <w:pPr>
+              <w:spacing w:after="0"/>
+              <w:jc w:val="center"/>
+            </w:pPr>
+            <w:r>
+              <w:rPr>
+                <w:b/>
+              </w:rPr>
+              <w:t>PT. TELKOM AKSES</w:t>
+            </w:r>
+            <w:r>
+              <w:rPr>
+                <w:b/>
+              </w:rPr>
+              <w:br/>
+              <w:t>MGR PROJECT DEPLOYMENT</w:t>
+            </w:r>
+            <w:r>
+              <w:rPr>
+                <w:b/>
+              </w:rPr>
+              <w:br/>
+              <w:t>AREA JAWA BALI</w:t>
+            </w:r>
+            <w:r>
+              <w:rPr>
+                <w:b/>
+              </w:rPr>
+              <w:br/>
+            </w:r>
+            <w:r>
+              <w:br/>
+            </w:r>
+            <w:r>
+              <w:br/>
+            </w:r>
+            <w:r>
+              <w:br/>
+            </w:r>
+            <w:r>
+              <w:rPr>
+                <w:b/>
+                <w:u w:val="single"/>
+              </w:rPr>
+              <w:t>{signer3Name}</w:t>
+            </w:r>
+            <w:r>
+              <w:rPr>
+                <w:b/>
+                <w:u w:val="single"/>
+              </w:rPr>
+              <w:br/>
+            </w:r>
+            <w:r>
+              <w:rPr>
+                <w:b/>
+              </w:rPr>
+              <w:t>{signer3Nik}</w:t>
+            </w:r>
+          </w:p>
+        </w:tc>
+        <w:tc>
+          <w:tcPr>
+            <w:tcW w:w="3458" w:type="dxa"/>
+            <w:tcBorders>
+              <w:top w:val="nil"/>
+              <w:left w:val="nil"/>
+              <w:bottom w:val="nil"/>
+              <w:right w:val="nil"/>
+            </w:tcBorders>
+            <w:tcMar>
+              <w:top w:w="40" w:type="dxa"/>
+              <w:left w:w="60" w:type="dxa"/>
+              <w:bottom w:w="40" w:type="dxa"/>
+              <w:right w:w="60" w:type="dxa"/>
+            </w:tcMar>
+          </w:tcPr>
+          <w:p>
+            <w:pPr>
+              <w:spacing w:after="0"/>
+              <w:jc w:val="center"/>
+            </w:pPr>
+            <w:r>
+              <w:rPr>
+                <w:b/>
+              </w:rPr>
+              <w:t>PT. TELKOM INFRASTRUKTUR</w:t>
+            </w:r>
+            <w:r>
+              <w:rPr>
+                <w:b/>
+              </w:rPr>
+              <w:br/>
+              <w:t>INDONESIA</w:t>
+            </w:r>
+            <w:r>
+              <w:rPr>
+                <w:b/>
+              </w:rPr>
+              <w:br/>
+              <w:t>MGR NEW ACCESS NW DESIGN</w:t>
+            </w:r>
+            <w:r>
+              <w:rPr>
+                <w:b/>
+              </w:rPr>
+              <w:br/>
+              <w:t>ENGINEERING</w:t>
+            </w:r>
+            <w:r>
+              <w:rPr>
+                <w:b/>
+              </w:rPr>
+              <w:br/>
+            </w:r>
+            <w:r>
+              <w:br/>
+            </w:r>
+            <w:r>
+              <w:br/>
+            </w:r>
+            <w:r>
+              <w:br/>
+            </w:r>
+            <w:r>
+              <w:rPr>
+                <w:b/>
+                <w:u w:val="single"/>
+              </w:rPr>
+              <w:t>{signer4Name}</w:t>
+            </w:r>
+            <w:r>
+              <w:rPr>
+                <w:b/>
+                <w:u w:val="single"/>
+              </w:rPr>
+              <w:br/>
+            </w:r>
+            <w:r>
+              <w:rPr>
+                <w:b/>
+              </w:rPr>
+              <w:t>{signer4Nik}</w:t>
+            </w:r>
+          </w:p>
+        </w:tc>
+        <w:tc>
+          <w:tcPr>
+            <w:tcW w:w="3458" w:type="dxa"/>
+            <w:tcBorders>
+              <w:top w:val="nil"/>
+              <w:left w:val="nil"/>
+              <w:bottom w:val="nil"/>
+              <w:right w:val="nil"/>
+            </w:tcBorders>
+            <w:tcMar>
+              <w:top w:w="40" w:type="dxa"/>
+              <w:left w:w="60" w:type="dxa"/>
+              <w:bottom w:w="40" w:type="dxa"/>
+              <w:right w:w="60" w:type="dxa"/>
+            </w:tcMar>
+          </w:tcPr>
+          <w:p>
+            <w:pPr>
+              <w:spacing w:after="0"/>
+              <w:jc w:val="center"/>
+            </w:pPr>
+            <w:r>
+              <w:rPr>
+                <w:b/>
+              </w:rPr>
+              <w:t>PT. TELKOMSEL</w:t>
+            </w:r>
+            <w:r>
+              <w:rPr>
+                <w:b/>
+              </w:rPr>
+              <w:br/>
+              <w:t>MANAGER NETWORK</w:t>
+            </w:r>
+            <w:r>
+              <w:rPr>
+                <w:b/>
+              </w:rPr>
+              <w:br/>
+              <w:t>BROADBAND ACCESS</w:t>
+            </w:r>
+            <w:r>
+              <w:rPr>
+                <w:b/>
+              </w:rPr>
+              <w:br/>
+              <w:t>DEPLOYMENT</w:t>
+            </w:r>
+            <w:r>
+              <w:rPr>
+                <w:b/>
+              </w:rPr>
+              <w:br/>
+            </w:r>
+            <w:r>
+              <w:br/>
+            </w:r>
+            <w:r>
+              <w:br/>
+            </w:r>
+            <w:r>
+              <w:br/>
+            </w:r>
+            <w:r>
+              <w:rPr>
+                <w:b/>
+                <w:u w:val="single"/>
+              </w:rPr>
+              <w:t>{signer5Name}</w:t>
+            </w:r>
+            <w:r>
+              <w:rPr>
+                <w:b/>
+                <w:u w:val="single"/>
+              </w:rPr>
+              <w:br/>
+            </w:r>
+            <w:r>
+              <w:rPr>
+                <w:b/>
+              </w:rPr>
+              <w:t>{signer5Nik}</w:t>
+            </w:r>
+          </w:p>
+        </w:tc>
+      </w:tr>
+    </w:tbl>
+    <w:p>
+      <w:r>
+        <w:br w:type="page"/>
+      </w:r>
+    </w:p>
+    <w:p>
+      <w:pPr>
+        <w:keepNext/>
+        <w:jc w:val="center"/>
+      </w:pPr>
+      <w:r>
+        <w:rPr>
+          <w:b/>
+          <w:sz w:val="20"/>
+          <w:u w:val="single"/>
+        </w:rPr>
+        <w:lastRenderedPageBreak/>
+        <w:t>LAMPIRAN EVIDENCE</w:t>
+      </w:r>
+    </w:p>
+    <w:tbl>
+      <w:tblPr>
+        <w:tblStyle w:val="TableGrid"/>
+        <w:tblW w:w="0" w:type="auto"/>
+        <w:jc w:val="center"/>
+        <w:tblLayout w:type="fixed"/>
+        <w:tblLook w:val="04A0" w:firstRow="1" w:lastRow="0" w:firstColumn="1" w:lastColumn="0" w:noHBand="0" w:noVBand="1"/>
+      </w:tblPr>
+      <w:tblGrid>
+        <w:gridCol w:w="5187"/>
+        <w:gridCol w:w="5187"/>
+      </w:tblGrid>
+      <w:tr>
+        <w:trPr>
+          <w:trHeight w:val="4252"/>
+          <w:jc w:val="center"/>
+        </w:trPr>
+        <w:tc>
+          <w:tcPr>
+            <w:tcW w:w="5187" w:type="dxa"/>
+            <w:tcMar>
+              <w:top w:w="100" w:type="dxa"/>
+              <w:left w:w="100" w:type="dxa"/>
+              <w:bottom w:w="100" w:type="dxa"/>
+              <w:right w:w="100" w:type="dxa"/>
+            </w:tcMar>
+            <w:vAlign w:val="center"/>
+          </w:tcPr>
+          <w:p/>
+          <w:p/>
+          <w:p/>
+          <w:p/>
+          <w:p/>
+          <w:p/>
+          <w:p/>
+          <w:p/>
+          <w:p/>
+          <w:p/>
+          <w:p/>
+          <w:p/>
+          <w:p/>
+          <w:p/>
+          <w:p/>
+          <w:p/>
+          <w:p/>
+          <w:p/>
+          <w:p/>
+          <w:p/>
+          <w:p>
+            <w:r>
+              <w:t>{#</w:t>
+            </w:r>
+            <w:proofErr w:type="gramStart"/>
+            <w:r>
+              <w:t>evidenceRows}{</w:t>
+            </w:r>
+            <w:proofErr w:type="gramEnd"/>
+            <w:r>
+              <w:t>leftCaption}</w:t>
+            </w:r>
+          </w:p>
+        </w:tc>
+        <w:tc>
+          <w:tcPr>
+            <w:tcW w:w="5187" w:type="dxa"/>
+            <w:tcMar>
+              <w:top w:w="100" w:type="dxa"/>
+              <w:left w:w="100" w:type="dxa"/>
+              <w:bottom w:w="100" w:type="dxa"/>
+              <w:right w:w="100" w:type="dxa"/>
+            </w:tcMar>
+            <w:vAlign w:val="center"/>
+          </w:tcPr>
+          <w:p/>
+          <w:p/>
+          <w:p/>
+          <w:p/>
+          <w:p/>
+          <w:p/>
+          <w:p/>
+          <w:p/>
+          <w:p/>
+          <w:p/>
+          <w:p/>
+          <w:p/>
+          <w:p/>
+          <w:p/>
+          <w:p/>
+          <w:p/>
+          <w:p/>
+          <w:p/>
+          <w:p/>
+          <w:p>
+            <w:r>
+              <w:t>{</w:t>
+            </w:r>
+            <w:proofErr w:type="spellStart"/>
+            <w:r>
+              <w:t>rightCaption</w:t>
+            </w:r>
+            <w:proofErr w:type="spellEnd"/>
+            <w:r>
+              <w:t>}{/</w:t>
+            </w:r>
+            <w:proofErr w:type="spellStart"/>
+            <w:r>
+              <w:t>evidenceRows</w:t>
+            </w:r>
+            <w:proofErr w:type="spellEnd"/>
+            <w:r>
+              <w:t>}</w:t>
+            </w:r>
+          </w:p>
+        </w:tc>
+      </w:tr>
+    </w:tbl>
+    <w:p/>
     <w:sectPr>
       <w:headerReference w:type="default" r:id="rId8"/>
       <w:pgSz w:w="11906" w:h="16838"/>
-      <w:pgMar w:top="624" w:right="624" w:bottom="680" w:left="624" w:header="720" w:footer="720" w:gutter="0"/>
+      <w:pgMar w:top="1332" w:right="624" w:bottom="680" w:left="624" w:header="255" w:footer="720" w:gutter="0"/>
       <w:cols w:space="720"/>
       <w:docGrid w:linePitch="360"/>
     </w:sectPr>
@@ -990,103 +1604,149 @@
     <w:pPr>
       <w:pStyle w:val="Header"/>
     </w:pPr>
-    <w:r>
-      <w:rPr>
-        <w:noProof/>
-      </w:rPr>
-      <w:drawing>
-        <wp:anchor distT="0" distB="0" distL="114300" distR="114300" simplePos="0" relativeHeight="251659264" behindDoc="1" locked="0" layoutInCell="1" allowOverlap="1" wp14:anchorId="1B1E207E" wp14:editId="343471D5">
-          <wp:simplePos x="0" y="0"/>
-          <wp:positionH relativeFrom="column">
-            <wp:posOffset>5242560</wp:posOffset>
-          </wp:positionH>
-          <wp:positionV relativeFrom="paragraph">
-            <wp:posOffset>-209550</wp:posOffset>
-          </wp:positionV>
-          <wp:extent cx="1524000" cy="507183"/>
-          <wp:effectExtent l="0" t="0" r="0" b="7620"/>
-          <wp:wrapNone/>
-          <wp:docPr id="890352108" name="Picture 2"/>
-          <wp:cNvGraphicFramePr>
-            <a:graphicFrameLocks xmlns:a="http://schemas.openxmlformats.org/drawingml/2006/main" noChangeAspect="1"/>
-          </wp:cNvGraphicFramePr>
-          <a:graphic xmlns:a="http://schemas.openxmlformats.org/drawingml/2006/main">
-            <a:graphicData uri="http://schemas.openxmlformats.org/drawingml/2006/picture">
-              <pic:pic xmlns:pic="http://schemas.openxmlformats.org/drawingml/2006/picture">
-                <pic:nvPicPr>
-                  <pic:cNvPr id="890352108" name="Picture 890352108"/>
-                  <pic:cNvPicPr/>
-                </pic:nvPicPr>
-                <pic:blipFill>
-                  <a:blip r:embed="rId1"/>
-                  <a:stretch>
-                    <a:fillRect/>
-                  </a:stretch>
-                </pic:blipFill>
-                <pic:spPr>
-                  <a:xfrm>
-                    <a:off x="0" y="0"/>
-                    <a:ext cx="1524000" cy="507183"/>
-                  </a:xfrm>
-                  <a:prstGeom prst="rect">
-                    <a:avLst/>
-                  </a:prstGeom>
-                </pic:spPr>
-              </pic:pic>
-            </a:graphicData>
-          </a:graphic>
-        </wp:anchor>
-      </w:drawing>
-    </w:r>
-    <w:r>
-      <w:rPr>
-        <w:noProof/>
-      </w:rPr>
-      <w:drawing>
-        <wp:anchor distT="0" distB="0" distL="114300" distR="114300" simplePos="0" relativeHeight="251658240" behindDoc="1" locked="0" layoutInCell="1" allowOverlap="1" wp14:anchorId="4EEAC719" wp14:editId="5DB871E9">
-          <wp:simplePos x="0" y="0"/>
-          <wp:positionH relativeFrom="column">
-            <wp:posOffset>3810</wp:posOffset>
-          </wp:positionH>
-          <wp:positionV relativeFrom="paragraph">
-            <wp:posOffset>-66675</wp:posOffset>
-          </wp:positionV>
-          <wp:extent cx="1600200" cy="463635"/>
-          <wp:effectExtent l="0" t="0" r="0" b="0"/>
-          <wp:wrapNone/>
-          <wp:docPr id="714596076" name="Picture 1"/>
-          <wp:cNvGraphicFramePr>
-            <a:graphicFrameLocks xmlns:a="http://schemas.openxmlformats.org/drawingml/2006/main" noChangeAspect="1"/>
-          </wp:cNvGraphicFramePr>
-          <a:graphic xmlns:a="http://schemas.openxmlformats.org/drawingml/2006/main">
-            <a:graphicData uri="http://schemas.openxmlformats.org/drawingml/2006/picture">
-              <pic:pic xmlns:pic="http://schemas.openxmlformats.org/drawingml/2006/picture">
-                <pic:nvPicPr>
-                  <pic:cNvPr id="714596076" name="Picture 714596076"/>
-                  <pic:cNvPicPr/>
-                </pic:nvPicPr>
-                <pic:blipFill>
-                  <a:blip r:embed="rId2"/>
-                  <a:stretch>
-                    <a:fillRect/>
-                  </a:stretch>
-                </pic:blipFill>
-                <pic:spPr>
-                  <a:xfrm>
-                    <a:off x="0" y="0"/>
-                    <a:ext cx="1600200" cy="463635"/>
-                  </a:xfrm>
-                  <a:prstGeom prst="rect">
-                    <a:avLst/>
-                  </a:prstGeom>
-                </pic:spPr>
-              </pic:pic>
-            </a:graphicData>
-          </a:graphic>
-        </wp:anchor>
-      </w:drawing>
-    </w:r>
   </w:p>
+  <w:tbl>
+    <w:tblPr>
+      <w:tblW w:w="0" w:type="auto"/>
+      <w:jc w:val="center"/>
+      <w:tblLayout w:type="fixed"/>
+      <w:tblLook w:val="04A0" w:firstRow="1" w:lastRow="0" w:firstColumn="1" w:lastColumn="0" w:noHBand="0" w:noVBand="1"/>
+    </w:tblPr>
+    <w:tblGrid>
+      <w:gridCol w:w="5329"/>
+      <w:gridCol w:w="5329"/>
+    </w:tblGrid>
+    <w:tr>
+      <w:trPr>
+        <w:jc w:val="center"/>
+      </w:trPr>
+      <w:tc>
+        <w:tcPr>
+          <w:tcW w:w="5329" w:type="dxa"/>
+          <w:tcBorders>
+            <w:top w:val="nil"/>
+            <w:left w:val="nil"/>
+            <w:bottom w:val="nil"/>
+            <w:right w:val="nil"/>
+          </w:tcBorders>
+          <w:tcMar>
+            <w:top w:w="0" w:type="dxa"/>
+            <w:left w:w="0" w:type="dxa"/>
+            <w:bottom w:w="0" w:type="dxa"/>
+            <w:right w:w="0" w:type="dxa"/>
+          </w:tcMar>
+        </w:tcPr>
+        <w:p>
+          <w:pPr>
+            <w:spacing w:after="0"/>
+          </w:pPr>
+          <w:r>
+            <w:rPr>
+              <w:noProof/>
+            </w:rPr>
+            <w:drawing>
+              <wp:inline distT="0" distB="0" distL="0" distR="0" wp14:anchorId="518CE000" wp14:editId="247A3100">
+                <wp:extent cx="1475999" cy="427649"/>
+                <wp:effectExtent l="0" t="0" r="0" b="0"/>
+                <wp:docPr id="1" name="Picture 1"/>
+                <wp:cNvGraphicFramePr>
+                  <a:graphicFrameLocks xmlns:a="http://schemas.openxmlformats.org/drawingml/2006/main" noChangeAspect="1"/>
+                </wp:cNvGraphicFramePr>
+                <a:graphic xmlns:a="http://schemas.openxmlformats.org/drawingml/2006/main">
+                  <a:graphicData uri="http://schemas.openxmlformats.org/drawingml/2006/picture">
+                    <pic:pic xmlns:pic="http://schemas.openxmlformats.org/drawingml/2006/picture">
+                      <pic:nvPicPr>
+                        <pic:cNvPr id="0" name="infranexia.png"/>
+                        <pic:cNvPicPr/>
+                      </pic:nvPicPr>
+                      <pic:blipFill>
+                        <a:blip r:embed="rId1"/>
+                        <a:stretch>
+                          <a:fillRect/>
+                        </a:stretch>
+                      </pic:blipFill>
+                      <pic:spPr>
+                        <a:xfrm>
+                          <a:off x="0" y="0"/>
+                          <a:ext cx="1475999" cy="427649"/>
+                        </a:xfrm>
+                        <a:prstGeom prst="rect">
+                          <a:avLst/>
+                        </a:prstGeom>
+                      </pic:spPr>
+                    </pic:pic>
+                  </a:graphicData>
+                </a:graphic>
+              </wp:inline>
+            </w:drawing>
+          </w:r>
+        </w:p>
+      </w:tc>
+      <w:tc>
+        <w:tcPr>
+          <w:tcW w:w="5329" w:type="dxa"/>
+          <w:tcBorders>
+            <w:top w:val="nil"/>
+            <w:left w:val="nil"/>
+            <w:bottom w:val="nil"/>
+            <w:right w:val="nil"/>
+          </w:tcBorders>
+          <w:tcMar>
+            <w:top w:w="0" w:type="dxa"/>
+            <w:left w:w="0" w:type="dxa"/>
+            <w:bottom w:w="0" w:type="dxa"/>
+            <w:right w:w="0" w:type="dxa"/>
+          </w:tcMar>
+        </w:tcPr>
+        <w:p>
+          <w:pPr>
+            <w:spacing w:after="0"/>
+            <w:jc w:val="right"/>
+          </w:pPr>
+          <w:r>
+            <w:rPr>
+              <w:noProof/>
+            </w:rPr>
+            <w:drawing>
+              <wp:inline distT="0" distB="0" distL="0" distR="0" wp14:anchorId="7EB68E09" wp14:editId="3C73E296">
+                <wp:extent cx="1368000" cy="455267"/>
+                <wp:effectExtent l="0" t="0" r="0" b="0"/>
+                <wp:docPr id="2" name="Picture 2"/>
+                <wp:cNvGraphicFramePr>
+                  <a:graphicFrameLocks xmlns:a="http://schemas.openxmlformats.org/drawingml/2006/main" noChangeAspect="1"/>
+                </wp:cNvGraphicFramePr>
+                <a:graphic xmlns:a="http://schemas.openxmlformats.org/drawingml/2006/main">
+                  <a:graphicData uri="http://schemas.openxmlformats.org/drawingml/2006/picture">
+                    <pic:pic xmlns:pic="http://schemas.openxmlformats.org/drawingml/2006/picture">
+                      <pic:nvPicPr>
+                        <pic:cNvPr id="0" name="telkomakses.png"/>
+                        <pic:cNvPicPr/>
+                      </pic:nvPicPr>
+                      <pic:blipFill>
+                        <a:blip r:embed="rId2"/>
+                        <a:stretch>
+                          <a:fillRect/>
+                        </a:stretch>
+                      </pic:blipFill>
+                      <pic:spPr>
+                        <a:xfrm>
+                          <a:off x="0" y="0"/>
+                          <a:ext cx="1368000" cy="455267"/>
+                        </a:xfrm>
+                        <a:prstGeom prst="rect">
+                          <a:avLst/>
+                        </a:prstGeom>
+                      </pic:spPr>
+                    </pic:pic>
+                  </a:graphicData>
+                </a:graphic>
+              </wp:inline>
+            </w:drawing>
+          </w:r>
+        </w:p>
+      </w:tc>
+    </w:tr>
+  </w:tbl>
 </w:hdr>
 </file>
 
@@ -1263,31 +1923,31 @@
       </w:rPr>
     </w:lvl>
   </w:abstractNum>
-  <w:num w:numId="1" w16cid:durableId="2065181357">
+  <w:num w:numId="1" w16cid:durableId="1312489552">
     <w:abstractNumId w:val="8"/>
   </w:num>
-  <w:num w:numId="2" w16cid:durableId="886843015">
+  <w:num w:numId="2" w16cid:durableId="1052147014">
     <w:abstractNumId w:val="6"/>
   </w:num>
-  <w:num w:numId="3" w16cid:durableId="2136605072">
+  <w:num w:numId="3" w16cid:durableId="836263546">
     <w:abstractNumId w:val="5"/>
   </w:num>
-  <w:num w:numId="4" w16cid:durableId="148254085">
+  <w:num w:numId="4" w16cid:durableId="1942565777">
     <w:abstractNumId w:val="4"/>
   </w:num>
-  <w:num w:numId="5" w16cid:durableId="1306936542">
+  <w:num w:numId="5" w16cid:durableId="1817448738">
     <w:abstractNumId w:val="7"/>
   </w:num>
-  <w:num w:numId="6" w16cid:durableId="1114909770">
+  <w:num w:numId="6" w16cid:durableId="1573153514">
     <w:abstractNumId w:val="3"/>
   </w:num>
-  <w:num w:numId="7" w16cid:durableId="1675719930">
+  <w:num w:numId="7" w16cid:durableId="761990312">
     <w:abstractNumId w:val="2"/>
   </w:num>
-  <w:num w:numId="8" w16cid:durableId="1485122244">
+  <w:num w:numId="8" w16cid:durableId="948396164">
     <w:abstractNumId w:val="1"/>
   </w:num>
-  <w:num w:numId="9" w16cid:durableId="1018653921">
+  <w:num w:numId="9" w16cid:durableId="1721589791">
     <w:abstractNumId w:val="0"/>
   </w:num>
 </w:numbering>

</xml_diff>